<commit_message>
Restore the older Chapter 1 file; the render tool rewrote it by accident.
</commit_message>
<xml_diff>
--- a/thesis/Chapter1 - with citations.docx
+++ b/thesis/Chapter1 - with citations.docx
@@ -44,11 +44,7 @@
         <w:pStyle w:val="ParagraphFirstandLast"/>
       </w:pPr>
       <w:r>
-        <w:t xml:space="preserve">This project develops a web-based PSM Management System. It centralises the entire project lifecycle. It is built as a decoupled web application, following the approach taken by other web-based academic systems at the faculty that replaced manual methods with a centralised electronic platform (Chong &amp; Arbaiy, 2022). The system handles supervision and panel allocation. It manages titles, milestones and file submissions. Rubric-based assessment covers supervisors and examiners. Marks are released automatically after all assessors submit. The system also provides reports, </w:t>
-      </w:r>
-      <w:r>
-        <w:lastRenderedPageBreak/>
-        <w:t>reminders and notifications. Completed projects are archived with a full audit trail. It replaces disconnected manual processes with one record.</w:t>
+        <w:t>This project develops a web-based PSM Management System. It centralises the entire project lifecycle. It is built as a decoupled web application, following the approach taken by other web-based academic systems at the faculty that replaced manual methods with a centralised electronic platform (Chong &amp; Arbaiy, 2022). The system handles supervision and panel allocation. It manages titles, milestones and file submissions. Rubric-based assessment covers supervisors and examiners. Marks are released automatically after all assessors submit. The system also provides reports, reminders and notifications. Completed projects are archived with a full audit trail. It replaces disconnected manual processes with one record.</w:t>
       </w:r>
     </w:p>
     <w:p>
@@ -56,6 +52,7 @@
         <w:pStyle w:val="Heading2"/>
       </w:pPr>
       <w:r>
+        <w:lastRenderedPageBreak/>
         <w:t>Problem Statement</w:t>
       </w:r>
     </w:p>
@@ -97,7 +94,6 @@
         <w:pStyle w:val="ParagraphFirstandLast"/>
       </w:pPr>
       <w:r>
-        <w:lastRenderedPageBreak/>
         <w:t>Taken together, these problems mean that a significant proportion of the effort invested in PSM is spent on administration rather than on supervision and learning. The purpose of this project is to design and develop a system that removes that administrative burden by making the process explicit, enforceable and visible. A further benefit is that matching students to supervisors can be made on recorded expertise rather than on manual selection, which has been shown to produce mismatches between a student's research and a supervisor's expertise (Tam &amp; Abdullah, 2025).</w:t>
       </w:r>
     </w:p>
@@ -120,6 +116,7 @@
         <w:pStyle w:val="Heading2"/>
       </w:pPr>
       <w:r>
+        <w:lastRenderedPageBreak/>
         <w:t>Objectives</w:t>
       </w:r>
     </w:p>
@@ -263,7 +260,6 @@
         <w:pStyle w:val="ParagraphFirstandLast"/>
       </w:pPr>
       <w:r>
-        <w:lastRenderedPageBreak/>
         <w:t>The system is organised into eight modules, as summarised in Table 1.1.</w:t>
       </w:r>
     </w:p>
@@ -449,11 +445,14 @@
           <w:tcPr>
             <w:cnfStyle w:val="001000000000" w:firstRow="0" w:lastRow="0" w:firstColumn="1" w:lastColumn="0" w:oddVBand="0" w:evenVBand="0" w:oddHBand="0" w:evenHBand="0" w:firstRowFirstColumn="0" w:firstRowLastColumn="0" w:lastRowFirstColumn="0" w:lastRowLastColumn="0"/>
             <w:tcW w:w="0" w:type="auto"/>
+            <w:hideMark/>
           </w:tcPr>
           <w:p>
             <w:pPr>
               <w:rPr>
                 <w:rFonts w:cs="Times New Roman"/>
+                <w:b w:val="0"/>
+                <w:bCs w:val="0"/>
                 <w:szCs w:val="24"/>
               </w:rPr>
             </w:pPr>
@@ -464,31 +463,15 @@
                 <w:bCs w:val="0"/>
                 <w:szCs w:val="24"/>
               </w:rPr>
-              <w:t>2</w:t>
-            </w:r>
-            <w:r>
-              <w:rPr>
-                <w:rFonts w:cs="Times New Roman"/>
-                <w:b w:val="0"/>
-                <w:bCs w:val="0"/>
-                <w:szCs w:val="24"/>
-              </w:rPr>
-              <w:t xml:space="preserve">. </w:t>
-            </w:r>
-            <w:r>
-              <w:rPr>
-                <w:rFonts w:cs="Times New Roman"/>
-                <w:b w:val="0"/>
-                <w:bCs w:val="0"/>
-                <w:szCs w:val="24"/>
-              </w:rPr>
-              <w:t>Title Approval and Registration</w:t>
+              <w:lastRenderedPageBreak/>
+              <w:t>2. User Profile &amp; Assignment Management</w:t>
             </w:r>
           </w:p>
         </w:tc>
         <w:tc>
           <w:tcPr>
             <w:tcW w:w="0" w:type="auto"/>
+            <w:hideMark/>
           </w:tcPr>
           <w:p>
             <w:pPr>
@@ -503,15 +486,17 @@
                 <w:rFonts w:cs="Times New Roman"/>
                 <w:szCs w:val="24"/>
               </w:rPr>
-              <w:t xml:space="preserve">• </w:t>
+              <w:t>Student and supervisor profiles, areas of expertise, and enforceable supervisor-to-student allocation with per-batch capacity.</w:t>
             </w:r>
-            <w:r>
+          </w:p>
+          <w:p>
+            <w:pPr>
+              <w:cnfStyle w:val="000000000000" w:firstRow="0" w:lastRow="0" w:firstColumn="0" w:lastColumn="0" w:oddVBand="0" w:evenVBand="0" w:oddHBand="0" w:evenHBand="0" w:firstRowFirstColumn="0" w:firstRowLastColumn="0" w:lastRowFirstColumn="0" w:lastRowLastColumn="0"/>
               <w:rPr>
                 <w:rFonts w:cs="Times New Roman"/>
                 <w:szCs w:val="24"/>
               </w:rPr>
-              <w:t>Candidate title submission, panel decision on the proposal, correction form for conditional approvals, and registration of the confirmed title.</w:t>
-            </w:r>
+            </w:pPr>
           </w:p>
           <w:p>
             <w:pPr>
@@ -526,6 +511,7 @@
         <w:tc>
           <w:tcPr>
             <w:tcW w:w="0" w:type="auto"/>
+            <w:hideMark/>
           </w:tcPr>
           <w:p>
             <w:pPr>
@@ -537,10 +523,10 @@
             </w:pPr>
             <w:r>
               <w:rPr>
-                <w:rFonts w:cs="Times New Roman" w:hint="eastAsia"/>
+                <w:rFonts w:cs="Times New Roman"/>
                 <w:szCs w:val="24"/>
               </w:rPr>
-              <w:t>Supervisor, Examiner, Student</w:t>
+              <w:t>Admin, Coordinator</w:t>
             </w:r>
           </w:p>
         </w:tc>
@@ -568,16 +554,7 @@
                 <w:bCs w:val="0"/>
                 <w:szCs w:val="24"/>
               </w:rPr>
-              <w:t>3</w:t>
-            </w:r>
-            <w:r>
-              <w:rPr>
-                <w:rFonts w:cs="Times New Roman"/>
-                <w:b w:val="0"/>
-                <w:bCs w:val="0"/>
-                <w:szCs w:val="24"/>
-              </w:rPr>
-              <w:t>. Project &amp; Milestone Management</w:t>
+              <w:t>3. Project &amp; Milestone Management</w:t>
             </w:r>
           </w:p>
         </w:tc>
@@ -664,16 +641,7 @@
                 <w:bCs w:val="0"/>
                 <w:szCs w:val="24"/>
               </w:rPr>
-              <w:t>4</w:t>
-            </w:r>
-            <w:r>
-              <w:rPr>
-                <w:rFonts w:cs="Times New Roman"/>
-                <w:b w:val="0"/>
-                <w:bCs w:val="0"/>
-                <w:szCs w:val="24"/>
-              </w:rPr>
-              <w:t>. Evaluation Engine &amp; Weighted Rubric Grading</w:t>
+              <w:t>4. Evaluation Engine &amp; Weighted Rubric Grading</w:t>
             </w:r>
           </w:p>
         </w:tc>
@@ -763,7 +731,7 @@
                 <w:bCs w:val="0"/>
                 <w:szCs w:val="24"/>
               </w:rPr>
-              <w:t>5. Reporting Dashboard</w:t>
+              <w:t>5. Cohort Analytics &amp; Reporting Dashboard</w:t>
             </w:r>
           </w:p>
         </w:tc>
@@ -844,7 +812,6 @@
                 <w:bCs w:val="0"/>
                 <w:szCs w:val="24"/>
               </w:rPr>
-              <w:lastRenderedPageBreak/>
               <w:t>6. Automated Notification &amp; Alert System</w:t>
             </w:r>
           </w:p>
@@ -903,6 +870,103 @@
           </w:p>
         </w:tc>
       </w:tr>
+      <w:tr>
+        <w:tc>
+          <w:tcPr>
+            <w:cnfStyle w:val="001000000000" w:firstRow="0" w:lastRow="0" w:firstColumn="1" w:lastColumn="0" w:oddVBand="0" w:evenVBand="0" w:oddHBand="0" w:evenHBand="0" w:firstRowFirstColumn="0" w:firstRowLastColumn="0" w:lastRowFirstColumn="0" w:lastRowLastColumn="0"/>
+            <w:tcW w:w="0" w:type="auto"/>
+            <w:hideMark/>
+          </w:tcPr>
+          <w:p>
+            <w:pPr>
+              <w:rPr>
+                <w:rFonts w:cs="Times New Roman"/>
+                <w:b w:val="0"/>
+                <w:bCs w:val="0"/>
+                <w:szCs w:val="24"/>
+              </w:rPr>
+            </w:pPr>
+            <w:r>
+              <w:rPr>
+                <w:rFonts w:cs="Times New Roman"/>
+                <w:b w:val="0"/>
+                <w:bCs w:val="0"/>
+                <w:szCs w:val="24"/>
+              </w:rPr>
+              <w:t xml:space="preserve">7. </w:t>
+            </w:r>
+            <w:r>
+              <w:rPr>
+                <w:rFonts w:cs="Times New Roman"/>
+                <w:b w:val="0"/>
+                <w:bCs w:val="0"/>
+                <w:szCs w:val="24"/>
+              </w:rPr>
+              <w:t>Title Approval and Registration</w:t>
+            </w:r>
+          </w:p>
+        </w:tc>
+        <w:tc>
+          <w:tcPr>
+            <w:tcW w:w="0" w:type="auto"/>
+            <w:hideMark/>
+          </w:tcPr>
+          <w:p>
+            <w:pPr>
+              <w:cnfStyle w:val="000000000000" w:firstRow="0" w:lastRow="0" w:firstColumn="0" w:lastColumn="0" w:oddVBand="0" w:evenVBand="0" w:oddHBand="0" w:evenHBand="0" w:firstRowFirstColumn="0" w:firstRowLastColumn="0" w:lastRowFirstColumn="0" w:lastRowLastColumn="0"/>
+              <w:rPr>
+                <w:rFonts w:cs="Times New Roman"/>
+                <w:szCs w:val="24"/>
+              </w:rPr>
+            </w:pPr>
+            <w:r>
+              <w:rPr>
+                <w:rFonts w:cs="Times New Roman"/>
+                <w:szCs w:val="24"/>
+              </w:rPr>
+              <w:t xml:space="preserve">• </w:t>
+            </w:r>
+            <w:r>
+              <w:rPr>
+                <w:rFonts w:cs="Times New Roman"/>
+                <w:szCs w:val="24"/>
+              </w:rPr>
+              <w:t>Candidate title submission, panel decision on the proposal, correction form for conditional approvals, and registration of the confirmed title.</w:t>
+            </w:r>
+          </w:p>
+          <w:p>
+            <w:pPr>
+              <w:cnfStyle w:val="000000000000" w:firstRow="0" w:lastRow="0" w:firstColumn="0" w:lastColumn="0" w:oddVBand="0" w:evenVBand="0" w:oddHBand="0" w:evenHBand="0" w:firstRowFirstColumn="0" w:firstRowLastColumn="0" w:lastRowFirstColumn="0" w:lastRowLastColumn="0"/>
+              <w:rPr>
+                <w:rFonts w:cs="Times New Roman"/>
+                <w:szCs w:val="24"/>
+              </w:rPr>
+            </w:pPr>
+          </w:p>
+        </w:tc>
+        <w:tc>
+          <w:tcPr>
+            <w:tcW w:w="0" w:type="auto"/>
+            <w:hideMark/>
+          </w:tcPr>
+          <w:p>
+            <w:pPr>
+              <w:cnfStyle w:val="000000000000" w:firstRow="0" w:lastRow="0" w:firstColumn="0" w:lastColumn="0" w:oddVBand="0" w:evenVBand="0" w:oddHBand="0" w:evenHBand="0" w:firstRowFirstColumn="0" w:firstRowLastColumn="0" w:lastRowFirstColumn="0" w:lastRowLastColumn="0"/>
+              <w:rPr>
+                <w:rFonts w:cs="Times New Roman"/>
+                <w:szCs w:val="24"/>
+              </w:rPr>
+            </w:pPr>
+            <w:r>
+              <w:rPr>
+                <w:rFonts w:cs="Times New Roman" w:hint="eastAsia"/>
+                <w:szCs w:val="24"/>
+              </w:rPr>
+              <w:t>Supervisor, Examiner, Student</w:t>
+            </w:r>
+          </w:p>
+        </w:tc>
+      </w:tr>
     </w:tbl>
     <w:p>
       <w:pPr>
@@ -917,6 +981,7 @@
         <w:pStyle w:val="Heading2"/>
       </w:pPr>
       <w:r>
+        <w:lastRenderedPageBreak/>
         <w:t>Project Significance</w:t>
       </w:r>
     </w:p>
@@ -973,7 +1038,6 @@
         <w:jc w:val="both"/>
       </w:pPr>
       <w:r>
-        <w:lastRenderedPageBreak/>
         <w:t>This chapter presents the background of the study, the problem statement, the objectives, the research scope, the significance of the project and the structure of the thesis.</w:t>
       </w:r>
     </w:p>
@@ -1020,6 +1084,7 @@
         <w:jc w:val="both"/>
       </w:pPr>
       <w:r>
+        <w:lastRenderedPageBreak/>
         <w:t>This chapter describes the research methodology and the software development model adopted, together with the phases, activities and deliverables of each phase.</w:t>
       </w:r>
     </w:p>
@@ -1098,6 +1163,7 @@
       </w:pPr>
     </w:p>
     <w:p>
+      <w:pPr/>
       <w:r>
         <w:rPr>
           <w:b/>
@@ -1122,11 +1188,7 @@
         <w:jc w:val="left"/>
       </w:pPr>
       <w:r>
-        <w:t xml:space="preserve">Chong, Z. Y., &amp; Arbaiy, N. (2022). Pre-Viva Assessment System Development for FSKTM, UTHM. Applied Information Technology and Computer Science, </w:t>
-      </w:r>
-      <w:r>
-        <w:lastRenderedPageBreak/>
-        <w:t>3(2), 1568-1587. https://periodical.uthm.edu.my/index.php/aitcs/article/view/7574</w:t>
+        <w:t>Chong, Z. Y., &amp; Arbaiy, N. (2022). Pre-Viva Assessment System Development for FSKTM, UTHM. Applied Information Technology and Computer Science, 3(2), 1568-1587. https://periodical.uthm.edu.my/index.php/aitcs/article/view/7574</w:t>
       </w:r>
     </w:p>
     <w:p>

</xml_diff>